<commit_message>
docs(report): update and humanize fall detection claims and prototype verification results
</commit_message>
<xml_diff>
--- a/Reports/MAJOR PROJECT RPT.docx
+++ b/Reports/MAJOR PROJECT RPT.docx
@@ -3291,7 +3291,7 @@
           <w:w w:val="105"/>
           <w:lang w:val="en-IN"/>
         </w:rPr>
-        <w:t>To resolve these limitations, this project presents </w:t>
+        <w:t xml:space="preserve">To address these challenges, this project presents </w:t>
       </w:r>
       <w:r>
         <w:rPr>
@@ -3307,7 +3307,7 @@
           <w:w w:val="105"/>
           <w:lang w:val="en-IN"/>
         </w:rPr>
-        <w:t>, an integrated, full-stack, and intelligent remote elderly care platform that bridges the communication gap between elderly patients, family guardians, and healthcare practitioners. The system incorporates a tri-tier, Role-Based Access Control (RBAC) architecture featuring a </w:t>
+        <w:t xml:space="preserve">, an integrated elderly care platform designed to connect elderly patients, family guardians, and healthcare practitioners. The system incorporates a tri-tier, Role-Based Access Control (RBAC) architecture featuring a </w:t>
       </w:r>
       <w:r>
         <w:rPr>
@@ -3323,7 +3323,7 @@
           <w:w w:val="105"/>
           <w:lang w:val="en-IN"/>
         </w:rPr>
-        <w:t>, a </w:t>
+        <w:t xml:space="preserve">, a </w:t>
       </w:r>
       <w:r>
         <w:rPr>
@@ -3339,7 +3339,7 @@
           <w:w w:val="105"/>
           <w:lang w:val="en-IN"/>
         </w:rPr>
-        <w:t>, and a </w:t>
+        <w:t xml:space="preserve">, and a </w:t>
       </w:r>
       <w:r>
         <w:rPr>
@@ -3355,7 +3355,7 @@
           <w:w w:val="105"/>
           <w:lang w:val="en-IN"/>
         </w:rPr>
-        <w:t>. Real-time physiological telemetry—including heart rate, peripheral oxygen saturation (</w:t>
+        <w:t>. Real-time physiological telemetry—including heart rate, peripheral oxygen saturation (SpO2), blood pressure, body temperature, stress, and hydration—is monitored continuously and processed through real-time anomaly detection heuristics to identify critical vitals deviations and geofence breaches. The implemented system includes MPU6050-based fall detection integrated with the emergency SOS workflow. Functional testing on the physical prototype demonstrated successful triggering of the configured emergency alert under controlled physical movement.</w:t>
       </w:r>
       <m:oMath>
         <m:sSub>
@@ -3397,7 +3397,6 @@
           <w:w w:val="105"/>
           <w:lang w:val="en-IN"/>
         </w:rPr>
-        <w:t>), blood pressure, body temperature, stress, and hydration—is monitored continuously and processed through real-time anomaly detection heuristics to immediately identify critical vitals deviations, physical falls, and geofence breaches.</w:t>
       </w:r>
     </w:p>
     <w:p>
@@ -3415,7 +3414,7 @@
           <w:w w:val="105"/>
           <w:lang w:val="en-IN"/>
         </w:rPr>
-        <w:t>The platform provides an automated medication and routine scheduling engine with interactive adherence check-offs, instant SOS emergency dispatch protocols, and senior-centric accessibility features including a multilingual voice assistant supporting regional Indian languages (English, Hindi, Kannada, and Tamil). Developed using React 18, TypeScript, Tailwind CSS, Zustand, and Node.js/Express with PostgreSQL and JWT authentication, G-Care provides a scalable, secure, and cost-effective solution for proactive geriatric telecare. Experimental evaluations demonstrate responsive vitals synchronization, low alert dispatch latency, and significant reduction in caregiver dependency.</w:t>
+        <w:t>The platform provides an automated medication and routine scheduling engine with interactive adherence check-offs, instant SOS emergency dispatch protocols, and senior-centric accessibility features including a multilingual voice assistant supporting regional Indian languages (English, Hindi, Kannada, and Tamil). Developed using React 18, TypeScript, Tailwind CSS, Zustand, and Node.js/Express with JWT authentication and local data persistence, G-Care provides an accessible prototype for proactive geriatric telecare. Functional testing and system demonstrations confirmed responsive vitals synchronization between the edge prototype and web portals, consistent alert dispatch, and straightforward multi-role operation.</w:t>
       </w:r>
     </w:p>
     <w:p>
@@ -6088,21 +6087,8 @@
             <w:vAlign w:val="center"/>
           </w:tcPr>
           <w:p>
-            <w:pPr>
-              <w:pStyle w:val="TableParagraph"/>
-              <w:spacing w:before="164"/>
-              <w:ind w:left="798"/>
-              <w:rPr>
-                <w:sz w:val="24"/>
-                <w:szCs w:val="24"/>
-              </w:rPr>
-            </w:pPr>
             <w:r>
-              <w:rPr>
-                <w:sz w:val="24"/>
-                <w:szCs w:val="24"/>
-              </w:rPr>
-              <w:t>Comprehensive System Test Cases and Empirical Verification Results</w:t>
+              <w:t>System Test Cases and Verification Results</w:t>
             </w:r>
           </w:p>
         </w:tc>

</xml_diff>